<commit_message>
Mise à jour de la version anglaise de la piste de score
</commit_message>
<xml_diff>
--- a/pictures/Score-Track-en/Score-Track.docx
+++ b/pictures/Score-Track-en/Score-Track.docx
@@ -798,15 +798,23 @@
       <w:pPr>
         <w:jc w:val="center"/>
       </w:pPr>
+    </w:p>
+    <w:p>
+      <w:pPr>
+        <w:jc w:val="center"/>
+      </w:pPr>
       <w:r>
-        <w:rPr>
-          <w:noProof/>
-        </w:rPr>
         <w:drawing>
-          <wp:inline distT="0" distB="0" distL="0" distR="0" wp14:anchorId="24290FDC" wp14:editId="1D861A02">
-            <wp:extent cx="7915275" cy="5038725"/>
-            <wp:effectExtent l="0" t="0" r="9525" b="9525"/>
-            <wp:docPr id="1141928736" name="Image 1"/>
+          <wp:inline distT="0" distB="0" distL="0" distR="0" wp14:anchorId="23104979" wp14:editId="42DF68F8">
+            <wp:extent cx="7968163" cy="5078408"/>
+            <wp:effectExtent l="0" t="0" r="0" b="8255"/>
+            <wp:docPr id="4" name="Image 3">
+              <a:extLst xmlns:a="http://schemas.openxmlformats.org/drawingml/2006/main">
+                <a:ext uri="{FF2B5EF4-FFF2-40B4-BE49-F238E27FC236}">
+                  <a16:creationId xmlns:a16="http://schemas.microsoft.com/office/drawing/2014/main" id="{9156F4B5-97AB-CE35-4567-9E1955EC9BB7}"/>
+                </a:ext>
+              </a:extLst>
+            </wp:docPr>
             <wp:cNvGraphicFramePr>
               <a:graphicFrameLocks xmlns:a="http://schemas.openxmlformats.org/drawingml/2006/main" noChangeAspect="1"/>
             </wp:cNvGraphicFramePr>
@@ -814,36 +822,31 @@
               <a:graphicData uri="http://schemas.openxmlformats.org/drawingml/2006/picture">
                 <pic:pic xmlns:pic="http://schemas.openxmlformats.org/drawingml/2006/picture">
                   <pic:nvPicPr>
-                    <pic:cNvPr id="0" name="Picture 1"/>
+                    <pic:cNvPr id="4" name="Image 3">
+                      <a:extLst>
+                        <a:ext uri="{FF2B5EF4-FFF2-40B4-BE49-F238E27FC236}">
+                          <a16:creationId xmlns:a16="http://schemas.microsoft.com/office/drawing/2014/main" id="{9156F4B5-97AB-CE35-4567-9E1955EC9BB7}"/>
+                        </a:ext>
+                      </a:extLst>
+                    </pic:cNvPr>
                     <pic:cNvPicPr>
-                      <a:picLocks noChangeAspect="1" noChangeArrowheads="1"/>
+                      <a:picLocks noChangeAspect="1"/>
                     </pic:cNvPicPr>
                   </pic:nvPicPr>
                   <pic:blipFill>
-                    <a:blip r:embed="rId41">
-                      <a:extLst>
-                        <a:ext uri="{28A0092B-C50C-407E-A947-70E740481C1C}">
-                          <a14:useLocalDpi xmlns:a14="http://schemas.microsoft.com/office/drawing/2010/main" val="0"/>
-                        </a:ext>
-                      </a:extLst>
-                    </a:blip>
-                    <a:srcRect/>
+                    <a:blip r:embed="rId41"/>
                     <a:stretch>
                       <a:fillRect/>
                     </a:stretch>
                   </pic:blipFill>
-                  <pic:spPr bwMode="auto">
+                  <pic:spPr>
                     <a:xfrm>
                       <a:off x="0" y="0"/>
-                      <a:ext cx="7915275" cy="5038725"/>
+                      <a:ext cx="7968163" cy="5078408"/>
                     </a:xfrm>
                     <a:prstGeom prst="rect">
                       <a:avLst/>
                     </a:prstGeom>
-                    <a:noFill/>
-                    <a:ln>
-                      <a:noFill/>
-                    </a:ln>
                   </pic:spPr>
                 </pic:pic>
               </a:graphicData>
@@ -1585,7 +1588,6 @@
   <w:style w:type="character" w:default="1" w:styleId="Policepardfaut">
     <w:name w:val="Default Paragraph Font"/>
     <w:uiPriority w:val="1"/>
-    <w:semiHidden/>
     <w:unhideWhenUsed/>
   </w:style>
   <w:style w:type="table" w:default="1" w:styleId="TableauNormal">

</xml_diff>